<commit_message>
report proceeded, FPS counter added
</commit_message>
<xml_diff>
--- a/Take-Home-Assignment/Report/Report.docx
+++ b/Take-Home-Assignment/Report/Report.docx
@@ -1399,14 +1399,7 @@
         <w:rPr>
           <w:rFonts w:ascii="Times New Roman" w:hAnsi="Times New Roman" w:cs="Times New Roman"/>
         </w:rPr>
-        <w:t>(2D window is in focus</w:t>
-      </w:r>
-      <w:proofErr w:type="gramStart"/>
-      <w:r>
-        <w:rPr>
-          <w:rFonts w:ascii="Times New Roman" w:hAnsi="Times New Roman" w:cs="Times New Roman"/>
-        </w:rPr>
-        <w:t>)</w:t>
+        <w:t>(2D window is in focus)</w:t>
       </w:r>
       <w:r>
         <w:rPr>
@@ -1420,7 +1413,6 @@
         </w:rPr>
         <w:t>.</w:t>
       </w:r>
-      <w:proofErr w:type="gramEnd"/>
     </w:p>
     <w:p>
       <w:pPr>
@@ -2667,6 +2659,27 @@
     </w:p>
     <w:p>
       <w:pPr>
+        <w:pStyle w:val="imgcaption"/>
+        <w:rPr>
+          <w:noProof/>
+        </w:rPr>
+      </w:pPr>
+      <w:r>
+        <w:rPr>
+          <w:i w:val="0"/>
+          <w:noProof/>
+        </w:rPr>
+        <w:t>5.</w:t>
+      </w:r>
+      <w:r>
+        <w:rPr>
+          <w:noProof/>
+        </w:rPr>
+        <w:t xml:space="preserve"> figure: the scene that the survey takers had to recreate</w:t>
+      </w:r>
+    </w:p>
+    <w:p>
+      <w:pPr>
         <w:rPr>
           <w:noProof/>
         </w:rPr>
@@ -2858,7 +2871,85 @@
         <w:t>valuation</w:t>
       </w:r>
     </w:p>
-    <w:p/>
+    <w:p>
+      <w:pPr>
+        <w:jc w:val="center"/>
+      </w:pPr>
+      <w:r>
+        <w:drawing>
+          <wp:inline distT="0" distB="0" distL="0" distR="0" wp14:anchorId="79C9404A" wp14:editId="460A8974">
+            <wp:extent cx="2653200" cy="1152000"/>
+            <wp:effectExtent l="0" t="0" r="0" b="0"/>
+            <wp:docPr id="1177720937" name="Kép 1"/>
+            <wp:cNvGraphicFramePr>
+              <a:graphicFrameLocks xmlns:a="http://schemas.openxmlformats.org/drawingml/2006/main" noChangeAspect="1"/>
+            </wp:cNvGraphicFramePr>
+            <a:graphic xmlns:a="http://schemas.openxmlformats.org/drawingml/2006/main">
+              <a:graphicData uri="http://schemas.openxmlformats.org/drawingml/2006/picture">
+                <pic:pic xmlns:pic="http://schemas.openxmlformats.org/drawingml/2006/picture">
+                  <pic:nvPicPr>
+                    <pic:cNvPr id="1177720937" name=""/>
+                    <pic:cNvPicPr/>
+                  </pic:nvPicPr>
+                  <pic:blipFill>
+                    <a:blip r:embed="rId12"/>
+                    <a:stretch>
+                      <a:fillRect/>
+                    </a:stretch>
+                  </pic:blipFill>
+                  <pic:spPr>
+                    <a:xfrm>
+                      <a:off x="0" y="0"/>
+                      <a:ext cx="2653200" cy="1152000"/>
+                    </a:xfrm>
+                    <a:prstGeom prst="rect">
+                      <a:avLst/>
+                    </a:prstGeom>
+                  </pic:spPr>
+                </pic:pic>
+              </a:graphicData>
+            </a:graphic>
+          </wp:inline>
+        </w:drawing>
+      </w:r>
+      <w:r>
+        <w:drawing>
+          <wp:inline distT="0" distB="0" distL="0" distR="0" wp14:anchorId="0CE4050F" wp14:editId="1D4809AC">
+            <wp:extent cx="2642400" cy="1152000"/>
+            <wp:effectExtent l="0" t="0" r="5715" b="0"/>
+            <wp:docPr id="1909298680" name="Kép 1"/>
+            <wp:cNvGraphicFramePr>
+              <a:graphicFrameLocks xmlns:a="http://schemas.openxmlformats.org/drawingml/2006/main" noChangeAspect="1"/>
+            </wp:cNvGraphicFramePr>
+            <a:graphic xmlns:a="http://schemas.openxmlformats.org/drawingml/2006/main">
+              <a:graphicData uri="http://schemas.openxmlformats.org/drawingml/2006/picture">
+                <pic:pic xmlns:pic="http://schemas.openxmlformats.org/drawingml/2006/picture">
+                  <pic:nvPicPr>
+                    <pic:cNvPr id="1909298680" name=""/>
+                    <pic:cNvPicPr/>
+                  </pic:nvPicPr>
+                  <pic:blipFill>
+                    <a:blip r:embed="rId13"/>
+                    <a:stretch>
+                      <a:fillRect/>
+                    </a:stretch>
+                  </pic:blipFill>
+                  <pic:spPr>
+                    <a:xfrm>
+                      <a:off x="0" y="0"/>
+                      <a:ext cx="2642400" cy="1152000"/>
+                    </a:xfrm>
+                    <a:prstGeom prst="rect">
+                      <a:avLst/>
+                    </a:prstGeom>
+                  </pic:spPr>
+                </pic:pic>
+              </a:graphicData>
+            </a:graphic>
+          </wp:inline>
+        </w:drawing>
+      </w:r>
+    </w:p>
     <w:p>
       <w:pPr>
         <w:pStyle w:val="Cmsor2"/>
@@ -3296,6 +3387,7 @@
         <w:rPr>
           <w:rFonts w:ascii="Times New Roman" w:hAnsi="Times New Roman" w:cs="Times New Roman"/>
         </w:rPr>
+        <w:lastRenderedPageBreak/>
         <w:t xml:space="preserve">OpenGL rendering, the system allows </w:t>
       </w:r>
       <w:r>
@@ -3393,6 +3485,56 @@
           <w:rFonts w:ascii="Times New Roman" w:hAnsi="Times New Roman" w:cs="Times New Roman"/>
         </w:rPr>
         <w:t xml:space="preserve"> with physics awareness.</w:t>
+      </w:r>
+    </w:p>
+    <w:p>
+      <w:pPr>
+        <w:pStyle w:val="Cmsor2"/>
+      </w:pPr>
+      <w:r>
+        <w:t>Task-per-Member</w:t>
+      </w:r>
+    </w:p>
+    <w:p>
+      <w:r>
+        <w:t xml:space="preserve">Emmanouil Platakis: 3D window and interactions (moving  of camera+ object manipulation, connection </w:t>
+      </w:r>
+      <w:r>
+        <w:t xml:space="preserve">of </w:t>
+      </w:r>
+      <w:r>
+        <w:t>2D with 3D window, report writing, survey conduction (Group 2)</w:t>
+      </w:r>
+      <w:r>
+        <w:t>, qualitative analysis – complexity of objects vs FPS</w:t>
+      </w:r>
+    </w:p>
+    <w:p>
+      <w:pPr>
+        <w:rPr>
+          <w:rFonts w:ascii="Times New Roman" w:hAnsi="Times New Roman" w:cs="Times New Roman"/>
+        </w:rPr>
+      </w:pPr>
+      <w:r>
+        <w:rPr>
+          <w:rFonts w:ascii="Times New Roman" w:hAnsi="Times New Roman" w:cs="Times New Roman"/>
+        </w:rPr>
+        <w:t>Kornidesz Máté: 2D window and 3 types of</w:t>
+      </w:r>
+      <w:r>
+        <w:rPr>
+          <w:rFonts w:ascii="Times New Roman" w:hAnsi="Times New Roman" w:cs="Times New Roman"/>
+        </w:rPr>
+        <w:t xml:space="preserve"> object creation, connection of 2D window with 3D window, report writing, survey conduction (Group 1), qualitative analysis - </w:t>
+      </w:r>
+      <w:r>
+        <w:t xml:space="preserve"># of </w:t>
+      </w:r>
+      <w:r>
+        <w:t xml:space="preserve">objects </w:t>
+      </w:r>
+      <w:r>
+        <w:t>vs FPS</w:t>
       </w:r>
     </w:p>
     <w:sectPr>

</xml_diff>